<commit_message>
ultima actualizacion hasta subir app a la playstore
</commit_message>
<xml_diff>
--- a/Docs/Baners.docx
+++ b/Docs/Baners.docx
@@ -3,17 +3,18 @@
 <w:document xmlns:wpc="http://schemas.microsoft.com/office/word/2010/wordprocessingCanvas" xmlns:cx="http://schemas.microsoft.com/office/drawing/2014/chartex" xmlns:cx1="http://schemas.microsoft.com/office/drawing/2015/9/8/chartex" xmlns:cx2="http://schemas.microsoft.com/office/drawing/2015/10/21/chartex" xmlns:cx3="http://schemas.microsoft.com/office/drawing/2016/5/9/chartex" xmlns:cx4="http://schemas.microsoft.com/office/drawing/2016/5/10/chartex" xmlns:cx5="http://schemas.microsoft.com/office/drawing/2016/5/11/chartex" xmlns:cx6="http://schemas.microsoft.com/office/drawing/2016/5/12/chartex" xmlns:cx7="http://schemas.microsoft.com/office/drawing/2016/5/13/chartex" xmlns:cx8="http://schemas.microsoft.com/office/drawing/2016/5/14/chartex" xmlns:mc="http://schemas.openxmlformats.org/markup-compatibility/2006" xmlns:aink="http://schemas.microsoft.com/office/drawing/2016/ink" xmlns:am3d="http://schemas.microsoft.com/office/drawing/2017/model3d" xmlns:o="urn:schemas-microsoft-com:office:office" xmlns:oel="http://schemas.microsoft.com/office/2019/extlst" xmlns:r="http://schemas.openxmlformats.org/officeDocument/2006/relationships" xmlns:m="http://schemas.openxmlformats.org/officeDocument/2006/math" xmlns:v="urn:schemas-microsoft-com:vml" xmlns:wp14="http://schemas.microsoft.com/office/word/2010/wordprocessingDrawing" xmlns:wp="http://schemas.openxmlformats.org/drawingml/2006/wordprocessingDrawing" xmlns:w10="urn:schemas-microsoft-com:office:word" xmlns:w="http://schemas.openxmlformats.org/wordprocessingml/2006/main" xmlns:w14="http://schemas.microsoft.com/office/word/2010/wordml" xmlns:w15="http://schemas.microsoft.com/office/word/2012/wordml" xmlns:w16cex="http://schemas.microsoft.com/office/word/2018/wordml/cex" xmlns:w16cid="http://schemas.microsoft.com/office/word/2016/wordml/cid" xmlns:w16="http://schemas.microsoft.com/office/word/2018/wordml" xmlns:w16sdtdh="http://schemas.microsoft.com/office/word/2020/wordml/sdtdatahash" xmlns:w16se="http://schemas.microsoft.com/office/word/2015/wordml/symex" xmlns:wpg="http://schemas.microsoft.com/office/word/2010/wordprocessingGroup" xmlns:wpi="http://schemas.microsoft.com/office/word/2010/wordprocessingInk" xmlns:wne="http://schemas.microsoft.com/office/word/2006/wordml" xmlns:wps="http://schemas.microsoft.com/office/word/2010/wordprocessingShape" mc:Ignorable="w14 w15 w16se w16cid w16 w16cex w16sdtdh wp14">
   <w:body>
     <w:p>
-      <w:proofErr w:type="spellStart"/>
       <w:r>
         <w:t>BanerInferior</w:t>
       </w:r>
-      <w:proofErr w:type="spellEnd"/>
     </w:p>
     <w:p>
       <w:r>
         <w:br/>
       </w:r>
       <w:r>
+        <w:rPr>
+          <w:noProof/>
+        </w:rPr>
         <w:drawing>
           <wp:inline distT="0" distB="0" distL="0" distR="0" wp14:anchorId="608988D7" wp14:editId="6F881E1F">
             <wp:extent cx="5612130" cy="3606800"/>
@@ -76,15 +77,16 @@
       </w:r>
     </w:p>
     <w:p>
-      <w:proofErr w:type="spellStart"/>
       <w:r>
         <w:lastRenderedPageBreak/>
         <w:t>BanerPaginaCompleta</w:t>
       </w:r>
-      <w:proofErr w:type="spellEnd"/>
-    </w:p>
-    <w:p>
-      <w:r>
+    </w:p>
+    <w:p>
+      <w:r>
+        <w:rPr>
+          <w:noProof/>
+        </w:rPr>
         <w:drawing>
           <wp:inline distT="0" distB="0" distL="0" distR="0" wp14:anchorId="1B2AE8E0" wp14:editId="0C7BC57C">
             <wp:extent cx="5612130" cy="3311525"/>
@@ -138,16 +140,17 @@
       </w:r>
     </w:p>
     <w:p>
-      <w:proofErr w:type="spellStart"/>
       <w:r>
         <w:lastRenderedPageBreak/>
         <w:t>BanerNativo</w:t>
       </w:r>
-      <w:proofErr w:type="spellEnd"/>
     </w:p>
     <w:p/>
     <w:p>
       <w:r>
+        <w:rPr>
+          <w:noProof/>
+        </w:rPr>
         <w:drawing>
           <wp:inline distT="0" distB="0" distL="0" distR="0" wp14:anchorId="2D441B10" wp14:editId="0AE4B991">
             <wp:extent cx="5612130" cy="3141345"/>
@@ -210,12 +213,10 @@
       <w:pPr>
         <w:ind w:firstLine="720"/>
       </w:pPr>
-      <w:proofErr w:type="spellStart"/>
       <w:r>
         <w:lastRenderedPageBreak/>
         <w:t>BanerAbierto</w:t>
       </w:r>
-      <w:proofErr w:type="spellEnd"/>
     </w:p>
     <w:p>
       <w:pPr>
@@ -227,6 +228,9 @@
         <w:ind w:firstLine="720"/>
       </w:pPr>
       <w:r>
+        <w:rPr>
+          <w:noProof/>
+        </w:rPr>
         <w:drawing>
           <wp:inline distT="0" distB="0" distL="0" distR="0" wp14:anchorId="3D4EF984" wp14:editId="4FF6D82A">
             <wp:extent cx="5612130" cy="3239770"/>
@@ -288,6 +292,57 @@
       </w:pPr>
       <w:r>
         <w:t>ca-app-pub-2336879831564913/1763480875</w:t>
+      </w:r>
+      <w:r>
+        <w:br/>
+      </w:r>
+    </w:p>
+    <w:p>
+      <w:r>
+        <w:br w:type="page"/>
+      </w:r>
+    </w:p>
+    <w:p>
+      <w:pPr>
+        <w:ind w:firstLine="720"/>
+      </w:pPr>
+      <w:r>
+        <w:lastRenderedPageBreak/>
+        <w:drawing>
+          <wp:inline distT="0" distB="0" distL="0" distR="0" wp14:anchorId="191B5CC0" wp14:editId="49C1EEBE">
+            <wp:extent cx="5087060" cy="2019582"/>
+            <wp:effectExtent l="0" t="0" r="0" b="0"/>
+            <wp:docPr id="5" name="Imagen 5"/>
+            <wp:cNvGraphicFramePr>
+              <a:graphicFrameLocks xmlns:a="http://schemas.openxmlformats.org/drawingml/2006/main" noChangeAspect="1"/>
+            </wp:cNvGraphicFramePr>
+            <a:graphic xmlns:a="http://schemas.openxmlformats.org/drawingml/2006/main">
+              <a:graphicData uri="http://schemas.openxmlformats.org/drawingml/2006/picture">
+                <pic:pic xmlns:pic="http://schemas.openxmlformats.org/drawingml/2006/picture">
+                  <pic:nvPicPr>
+                    <pic:cNvPr id="1" name=""/>
+                    <pic:cNvPicPr/>
+                  </pic:nvPicPr>
+                  <pic:blipFill>
+                    <a:blip r:embed="rId8"/>
+                    <a:stretch>
+                      <a:fillRect/>
+                    </a:stretch>
+                  </pic:blipFill>
+                  <pic:spPr>
+                    <a:xfrm>
+                      <a:off x="0" y="0"/>
+                      <a:ext cx="5087060" cy="2019582"/>
+                    </a:xfrm>
+                    <a:prstGeom prst="rect">
+                      <a:avLst/>
+                    </a:prstGeom>
+                  </pic:spPr>
+                </pic:pic>
+              </a:graphicData>
+            </a:graphic>
+          </wp:inline>
+        </w:drawing>
       </w:r>
     </w:p>
     <w:sectPr>

</xml_diff>